<commit_message>
docs: update content for Panel 1 (MA-01) according to latest source document
</commit_message>
<xml_diff>
--- a/public/doc/ảnh 6.docx
+++ b/public/doc/ảnh 6.docx
@@ -16,9 +16,25 @@
         <w:rPr>
           <w:b/>
           <w:szCs w:val="28"/>
+          <w:lang w:val="en-US"/>
+        </w:rPr>
+        <w:t>M</w:t>
+      </w:r>
+      <w:r>
+        <w:rPr>
+          <w:b/>
+          <w:szCs w:val="28"/>
           <w:lang w:val="vi-VN"/>
         </w:rPr>
-        <w:t>VI</w:t>
+        <w:t xml:space="preserve">ẢNG ẢNH </w:t>
+      </w:r>
+      <w:r>
+        <w:rPr>
+          <w:b/>
+          <w:szCs w:val="28"/>
+          <w:lang w:val="en-US"/>
+        </w:rPr>
+        <w:t>6:</w:t>
       </w:r>
       <w:r>
         <w:rPr>
@@ -26,69 +42,23 @@
           <w:szCs w:val="28"/>
           <w:lang w:val="vi-VN"/>
         </w:rPr>
-        <w:t xml:space="preserve">. </w:t>
-      </w:r>
-      <w:r>
-        <w:rPr>
-          <w:b/>
-          <w:szCs w:val="28"/>
-          <w:lang w:val="en-US"/>
-        </w:rPr>
-        <w:t>M</w:t>
-      </w:r>
-      <w:r>
-        <w:rPr>
-          <w:b/>
-          <w:szCs w:val="28"/>
-          <w:lang w:val="vi-VN"/>
-        </w:rPr>
-        <w:t>ẢNG ẢNH “ĐƠN VỊ CHÚNG TÔI”</w:t>
-      </w:r>
-    </w:p>
-    <w:p>
-      <w:pPr>
-        <w:spacing w:after="0"/>
-        <w:ind w:left="0" w:firstLine="720"/>
-        <w:rPr>
-          <w:b/>
-          <w:bCs/>
+        <w:t>“ĐƠN VỊ CHÚNG TÔI”</w:t>
+      </w:r>
+    </w:p>
+    <w:p>
+      <w:pPr>
+        <w:spacing w:after="0"/>
+        <w:ind w:left="0" w:firstLine="720"/>
+        <w:rPr>
           <w:i/>
           <w:iCs/>
         </w:rPr>
       </w:pPr>
       <w:r>
         <w:rPr>
-          <w:b/>
-          <w:bCs/>
           <w:i/>
           <w:iCs/>
         </w:rPr>
-        <w:t>1</w:t>
-      </w:r>
-      <w:r>
-        <w:rPr>
-          <w:b/>
-          <w:bCs/>
-          <w:i/>
-          <w:iCs/>
-        </w:rPr>
-        <w:t>) Chủ đề mảng ảnh:</w:t>
-      </w:r>
-    </w:p>
-    <w:p>
-      <w:pPr>
-        <w:spacing w:after="0"/>
-        <w:ind w:left="0" w:firstLine="720"/>
-        <w:rPr>
-          <w:i/>
-          <w:iCs/>
-        </w:rPr>
-      </w:pPr>
-      <w:r>
-        <w:rPr>
-          <w:i/>
-          <w:iCs/>
-        </w:rPr>
         <w:t>Thưa toàn thể các đồng chí!</w:t>
       </w:r>
     </w:p>
@@ -120,27 +90,6 @@
       </w:r>
       <w:r>
         <w:t>ơn vị của chúng tôi".</w:t>
-      </w:r>
-    </w:p>
-    <w:p>
-      <w:pPr>
-        <w:spacing w:after="0"/>
-        <w:ind w:left="0" w:firstLine="720"/>
-        <w:rPr>
-          <w:b/>
-          <w:bCs/>
-          <w:i/>
-          <w:iCs/>
-        </w:rPr>
-      </w:pPr>
-      <w:r>
-        <w:rPr>
-          <w:b/>
-          <w:bCs/>
-          <w:i/>
-          <w:iCs/>
-        </w:rPr>
-        <w:t>2) Kết cấu của mảng ảnh</w:t>
       </w:r>
     </w:p>
     <w:p>
@@ -303,7 +252,14 @@
           <w:spacing w:val="-8"/>
           <w:lang w:val="en-US"/>
         </w:rPr>
-        <w:t xml:space="preserve">Thứ hai,  cụm ảnh </w:t>
+        <w:t>Thứ hai,</w:t>
+      </w:r>
+      <w:r>
+        <w:rPr>
+          <w:spacing w:val="-8"/>
+          <w:lang w:val="en-US"/>
+        </w:rPr>
+        <w:t xml:space="preserve"> cụm ảnh </w:t>
       </w:r>
       <w:r>
         <w:rPr>
@@ -320,25 +276,6 @@
           <w:lang w:val="pl-PL" w:eastAsia="vi-VN"/>
         </w:rPr>
         <w:t>ãnh đạo, chỉ huy các cấp hiện nay.</w:t>
-      </w:r>
-    </w:p>
-    <w:p>
-      <w:pPr>
-        <w:spacing w:after="0"/>
-        <w:ind w:left="0" w:firstLine="720"/>
-        <w:rPr>
-          <w:rFonts w:eastAsia="Calibri"/>
-          <w:b/>
-          <w:lang w:val="pl-PL" w:eastAsia="vi-VN"/>
-        </w:rPr>
-      </w:pPr>
-      <w:r>
-        <w:rPr>
-          <w:rFonts w:eastAsia="Calibri"/>
-          <w:b/>
-          <w:lang w:val="pl-PL" w:eastAsia="vi-VN"/>
-        </w:rPr>
-        <w:t>Phân tích:</w:t>
       </w:r>
     </w:p>
     <w:p>
@@ -700,7 +637,6 @@
           <w:szCs w:val="28"/>
           <w:lang w:val="nl-NL"/>
         </w:rPr>
-        <w:lastRenderedPageBreak/>
         <w:t>1. Thiếu tướng Nguyễn Bá Lực - Tư lệnh Quân đoàn</w:t>
       </w:r>
       <w:r>
@@ -749,19 +685,24 @@
         <w:spacing w:after="0"/>
         <w:ind w:left="0" w:firstLine="720"/>
         <w:rPr>
-          <w:b/>
+          <w:szCs w:val="28"/>
+          <w:lang w:val="pt-BR"/>
+        </w:rPr>
+      </w:pPr>
+      <w:r>
+        <w:rPr>
           <w:color w:val="000000" w:themeColor="text1"/>
           <w:szCs w:val="28"/>
           <w:lang w:val="nl-NL"/>
         </w:rPr>
-      </w:pPr>
-      <w:r>
-        <w:rPr>
-          <w:color w:val="000000" w:themeColor="text1"/>
-          <w:szCs w:val="28"/>
-          <w:lang w:val="nl-NL"/>
-        </w:rPr>
-        <w:t>3. Thiếu tướng Trần Công Đức - Phó Tư lệnh kiêm TMT Quân đoàn.</w:t>
+        <w:t xml:space="preserve">3. Thiếu tướng Trần Công Đức - </w:t>
+      </w:r>
+      <w:r>
+        <w:rPr>
+          <w:szCs w:val="28"/>
+          <w:lang w:val="pt-BR"/>
+        </w:rPr>
+        <w:t>Phó Tư lệnh Tham mưu trưởng Quân đoàn.</w:t>
       </w:r>
     </w:p>
     <w:p>
@@ -783,6 +724,7 @@
           <w:szCs w:val="28"/>
           <w:lang w:val="nl-NL"/>
         </w:rPr>
+        <w:lastRenderedPageBreak/>
         <w:t>4. Thiếu tướng Nguyễn Trần Long - Phó Chính ủy Quân đoàn.</w:t>
       </w:r>
     </w:p>
@@ -926,18 +868,16 @@
         <w:spacing w:after="0"/>
         <w:ind w:left="0" w:firstLine="720"/>
         <w:rPr>
-          <w:spacing w:val="-14"/>
           <w:szCs w:val="28"/>
           <w:lang w:val="pt-BR"/>
         </w:rPr>
       </w:pPr>
       <w:r>
         <w:rPr>
-          <w:spacing w:val="-14"/>
           <w:szCs w:val="28"/>
           <w:lang w:val="pt-BR"/>
         </w:rPr>
-        <w:t>3. Thiếu tướng Trần Công Đức, Phó Tư lệnh kiêm Tham mưu trưởng Quân đoàn.</w:t>
+        <w:t>3. Thiếu tướng Trần Công Đức, Phó Tư lệnh Tham mưu trưởng Quân đoàn.</w:t>
       </w:r>
     </w:p>
     <w:p>
@@ -1342,50 +1282,58 @@
         <w:rPr>
           <w:spacing w:val="2"/>
         </w:rPr>
+        <w:t xml:space="preserve">Từ thực tiễn chiến đấu, xây dựng và trưởng thành, các thế hệ cán bộ, chiến sĩ Lữ đoàn đã xây đắp nên truyền thống vẻ vang: </w:t>
+      </w:r>
+      <w:r>
+        <w:rPr>
+          <w:b/>
+          <w:i/>
+          <w:spacing w:val="2"/>
+        </w:rPr>
+        <w:t>“Kiên cường, dũng cảm; đoàn kết, hiệp đồng; tự lực, tự cường, đã đánh là thắng.”</w:t>
+      </w:r>
+    </w:p>
+    <w:p>
+      <w:pPr>
+        <w:spacing w:after="0"/>
+        <w:ind w:left="0" w:firstLine="720"/>
+        <w:rPr>
+          <w:spacing w:val="-6"/>
+        </w:rPr>
+      </w:pPr>
+      <w:r>
+        <w:rPr>
+          <w:spacing w:val="-6"/>
+        </w:rPr>
+        <w:t>V</w:t>
+      </w:r>
+      <w:r>
+        <w:rPr>
+          <w:spacing w:val="-6"/>
+        </w:rPr>
+        <w:t xml:space="preserve">ới những chiến công đặc biệt xuất sắc đó, ngày 21/12/2009, Lữ đoàn vinh dự được Đảng, Nhà nước tuyên dương danh hiệu cao quý </w:t>
+      </w:r>
+      <w:r>
+        <w:rPr>
+          <w:b/>
+          <w:bCs/>
+          <w:spacing w:val="-6"/>
+        </w:rPr>
+        <w:t xml:space="preserve">Anh hùng Lực lượng vũ trang </w:t>
+      </w:r>
+      <w:r>
+        <w:rPr>
+          <w:b/>
+          <w:bCs/>
+          <w:spacing w:val="-6"/>
+        </w:rPr>
         <w:lastRenderedPageBreak/>
-        <w:t xml:space="preserve">Từ thực tiễn chiến đấu, xây dựng và trưởng thành, các thế hệ cán bộ, chiến sĩ Lữ đoàn đã xây đắp nên truyền thống vẻ vang: </w:t>
-      </w:r>
-      <w:r>
-        <w:rPr>
-          <w:b/>
-          <w:i/>
-          <w:spacing w:val="2"/>
-        </w:rPr>
-        <w:t>“Kiên cường, dũng cảm; đoàn kết, hiệp đồng; tự lực, tự cường, đã đánh là thắng.”</w:t>
-      </w:r>
-    </w:p>
-    <w:p>
-      <w:pPr>
-        <w:spacing w:after="0"/>
-        <w:ind w:left="0" w:firstLine="720"/>
+        <w:t>nhân dân</w:t>
+      </w:r>
+      <w:r>
         <w:rPr>
           <w:spacing w:val="-6"/>
         </w:rPr>
-      </w:pPr>
-      <w:r>
-        <w:rPr>
-          <w:spacing w:val="-6"/>
-        </w:rPr>
-        <w:t>V</w:t>
-      </w:r>
-      <w:r>
-        <w:rPr>
-          <w:spacing w:val="-6"/>
-        </w:rPr>
-        <w:t xml:space="preserve">ới những chiến công đặc biệt xuất sắc đó, ngày 21/12/2009, Lữ đoàn vinh dự được Đảng, Nhà nước tuyên dương danh hiệu cao quý </w:t>
-      </w:r>
-      <w:r>
-        <w:rPr>
-          <w:b/>
-          <w:bCs/>
-          <w:spacing w:val="-6"/>
-        </w:rPr>
-        <w:t>Anh hùng Lực lượng vũ trang nhân dân</w:t>
-      </w:r>
-      <w:r>
-        <w:rPr>
-          <w:spacing w:val="-6"/>
-        </w:rPr>
         <w:t xml:space="preserve"> trong kháng chiến chống Mỹ cứu nước. Cùng với đó là 5 tập thể và 5 cá nhân được phong tặng danh hiệu Anh hùng LLVTND. </w:t>
       </w:r>
     </w:p>
@@ -1401,7 +1349,19 @@
         <w:rPr>
           <w:spacing w:val="2"/>
         </w:rPr>
-        <w:t xml:space="preserve">Trên bảng ảnh là hình ảnh các đồng chí trong </w:t>
+        <w:t xml:space="preserve">Trên </w:t>
+      </w:r>
+      <w:r>
+        <w:rPr>
+          <w:spacing w:val="2"/>
+        </w:rPr>
+        <w:t>m</w:t>
+      </w:r>
+      <w:r>
+        <w:rPr>
+          <w:spacing w:val="2"/>
+        </w:rPr>
+        <w:t xml:space="preserve">ảng ảnh là hình ảnh các đồng chí trong </w:t>
       </w:r>
       <w:r>
         <w:rPr>
@@ -1447,6 +1407,13 @@
           <w:iCs/>
         </w:rPr>
         <w:t>Xuân Linh, P.</w:t>
+      </w:r>
+      <w:r>
+        <w:rPr>
+          <w:rStyle w:val="5yl5"/>
+          <w:iCs/>
+        </w:rPr>
+        <w:t xml:space="preserve"> </w:t>
       </w:r>
       <w:r>
         <w:rPr>
@@ -1509,7 +1476,7 @@
           <w:rStyle w:val="5yl5"/>
           <w:iCs/>
         </w:rPr>
-        <w:t xml:space="preserve">3. Đồng chí Thượng tá Lê Minh Thắng, UVTV, Phó Lữ đoàn trưởng kiêm </w:t>
+        <w:t xml:space="preserve">3. Đồng chí Thượng tá Lê Minh Thắng, UVTV, Phó Lữ đoàn trưởng </w:t>
       </w:r>
       <w:r>
         <w:rPr>
@@ -1554,41 +1521,14 @@
         <w:spacing w:after="0"/>
         <w:ind w:left="0" w:firstLine="720"/>
         <w:rPr>
-          <w:spacing w:val="2"/>
-        </w:rPr>
-      </w:pPr>
-      <w:r>
-        <w:rPr>
-          <w:spacing w:val="2"/>
+          <w:spacing w:val="-2"/>
+        </w:rPr>
+      </w:pPr>
+      <w:r>
+        <w:rPr>
+          <w:spacing w:val="-2"/>
         </w:rPr>
         <w:t>Dưới sự lãnh đạo, chỉ huy trực tiếp của Thủ trưởng, đơn vị luôn giữ vững đoàn kết, thống nhất; không ngừng đổi mới, nâng cao chất lượng huấn luyện, trình độ sẵn sàng chiến đấu; quản lý chặt chẽ vùng trời đảm nhiệm; xây dựng nền nếp chính quy, chấp hành nghiêm kỷ luật; chăm lo tốt đời sống vật chất, tinh thần cho bộ đội. Hình ảnh các Thủ trưởng là biểu tượng của tinh thần trách nhiệm, sự tận tụy và quyết tâm tiếp nối truyền thống anh hùng, đưa Lữ đoàn ngày càng phát triển vững mạnh.</w:t>
-      </w:r>
-    </w:p>
-    <w:p>
-      <w:pPr>
-        <w:spacing w:after="0"/>
-        <w:ind w:left="0" w:firstLine="720"/>
-        <w:rPr>
-          <w:b/>
-          <w:bCs/>
-          <w:spacing w:val="2"/>
-        </w:rPr>
-      </w:pPr>
-      <w:r>
-        <w:rPr>
-          <w:b/>
-          <w:bCs/>
-          <w:spacing w:val="2"/>
-        </w:rPr>
-        <w:t>3)</w:t>
-      </w:r>
-      <w:r>
-        <w:rPr>
-          <w:b/>
-          <w:bCs/>
-          <w:spacing w:val="2"/>
-        </w:rPr>
-        <w:t xml:space="preserve"> Định hướng tư tưởng:</w:t>
       </w:r>
     </w:p>
     <w:p>
@@ -1606,7 +1546,19 @@
         <w:rPr>
           <w:spacing w:val="2"/>
         </w:rPr>
-        <w:t>Qua nghe giới thiệu bảng ảnh truyền thống của Quân đoàn và Lữ đoàn, mỗi chúng ta cần nhận thức sâu sắc rằng: Những chiến công, thành tích mà các thế hệ cha anh đã bằng máu xương vun đắp không chỉ là niềm tự hào, mà còn là trách nhiệm lớn lao để thế hệ hôm nay kế thừa và phát huy.</w:t>
+        <w:t xml:space="preserve">Qua nghe giới thiệu </w:t>
+      </w:r>
+      <w:r>
+        <w:rPr>
+          <w:spacing w:val="2"/>
+        </w:rPr>
+        <w:t>m</w:t>
+      </w:r>
+      <w:r>
+        <w:rPr>
+          <w:spacing w:val="2"/>
+        </w:rPr>
+        <w:t>ảng ảnh truyền thống của Quân đoàn và Lữ đoàn, mỗi chúng ta cần nhận thức sâu sắc rằng: Những chiến công, thành tích mà các thế hệ cha anh đã bằng máu xương vun đắp không chỉ là niềm tự hào, mà còn là trách nhiệm lớn lao để thế hệ hôm nay kế thừa và phát huy.</w:t>
       </w:r>
     </w:p>
     <w:p>
@@ -1699,15 +1651,327 @@
         <w:t>Tự hào truyền thống vẻ vang, toàn thể cán bộ, chiến sĩ Tiểu đoàn 16 quyết tâm đoàn kết một lòng, xây dựng đơn vị vững mạnh toàn diện “mẫu mực, tiêu biểu”, luôn sẵn sàng chiến đấu cao, bảo vệ vững chắc bầu trời Tổ quốc, xứng đáng với niềm tin yêu của Đảng, Nhà nước, Quân đội và Nhân dân!</w:t>
       </w:r>
     </w:p>
-    <w:p/>
+    <w:p>
+      <w:pPr>
+        <w:spacing w:after="0"/>
+        <w:ind w:left="0" w:firstLine="709"/>
+        <w:jc w:val="left"/>
+        <w:rPr>
+          <w:b/>
+          <w:bCs/>
+          <w:color w:val="FF0000"/>
+          <w:spacing w:val="2"/>
+        </w:rPr>
+      </w:pPr>
+      <w:r>
+        <w:rPr>
+          <w:b/>
+          <w:bCs/>
+          <w:color w:val="FF0000"/>
+          <w:spacing w:val="2"/>
+        </w:rPr>
+        <w:t>Kính thưa các đồng chí!</w:t>
+      </w:r>
+    </w:p>
+    <w:p>
+      <w:pPr>
+        <w:spacing w:after="0"/>
+        <w:ind w:left="0" w:firstLine="709"/>
+        <w:jc w:val="left"/>
+        <w:rPr>
+          <w:color w:val="FF0000"/>
+          <w:spacing w:val="2"/>
+        </w:rPr>
+      </w:pPr>
+      <w:r>
+        <w:rPr>
+          <w:color w:val="FF0000"/>
+          <w:spacing w:val="2"/>
+        </w:rPr>
+        <w:t>Là người quân nhân, học tập và làm theo tư tưởng, đạo đức, phong cách Hồ Chí Minh, chúng ta không chỉ nâng cao bản lĩnh chính trị mà còn phải có trách nhiệm đấu tranh với những quan điểm sai trái, thông tin xuyên tạc, sai sự thật.</w:t>
+      </w:r>
+    </w:p>
+    <w:p>
+      <w:pPr>
+        <w:spacing w:after="0"/>
+        <w:ind w:left="0" w:firstLine="709"/>
+        <w:jc w:val="left"/>
+        <w:rPr>
+          <w:color w:val="FF0000"/>
+          <w:spacing w:val="2"/>
+        </w:rPr>
+      </w:pPr>
+      <w:r>
+        <w:rPr>
+          <w:color w:val="FF0000"/>
+          <w:spacing w:val="2"/>
+        </w:rPr>
+        <w:t xml:space="preserve">Qua sự việc được dư luận gọi là “cây 55”, chúng ta cần có thái độ tỉnh táo. Trước một vụ việc gây hậu quả nghiêm trọng, người dân có quyền đặt câu hỏi, bày tỏ sự đau buồn và yêu cầu làm rõ. Nhưng từ đó không có nghĩa là chúng ta </w:t>
+      </w:r>
+      <w:r>
+        <w:rPr>
+          <w:color w:val="FF0000"/>
+          <w:spacing w:val="2"/>
+        </w:rPr>
+        <w:lastRenderedPageBreak/>
+        <w:t>được phép chia sẻ thông tin chưa kiểm chứng, suy diễn hoặc lợi dụng vụ việc để xuyên tạc, kích động, gây mất đoàn kết.</w:t>
+      </w:r>
+    </w:p>
+    <w:p>
+      <w:pPr>
+        <w:spacing w:after="0"/>
+        <w:ind w:left="0" w:firstLine="709"/>
+        <w:rPr>
+          <w:color w:val="FF0000"/>
+          <w:spacing w:val="2"/>
+        </w:rPr>
+      </w:pPr>
+      <w:r>
+        <w:rPr>
+          <w:color w:val="FF0000"/>
+          <w:spacing w:val="2"/>
+        </w:rPr>
+        <w:t>Đấu tranh với quan điểm sai trái trước hết phải bắt đầu từ sự thật. Người quân nhân không chạy theo tin đồn, không chia sẻ thông tin chưa được kiểm chứng, không tranh luận bằng chửi bới hay cực đoan. Chúng ta phải kiểm tra nguồn tin, đối chiếu với thông tin chính thống, phân biệt rõ đâu là sự thật, đâu là ý kiến và đâu là thông tin</w:t>
+      </w:r>
+      <w:r>
+        <w:rPr>
+          <w:rFonts w:ascii="Segoe UI" w:eastAsia="Times New Roman" w:hAnsi="Segoe UI" w:cs="Segoe UI"/>
+          <w:color w:val="FF0000"/>
+          <w:kern w:val="0"/>
+          <w:sz w:val="24"/>
+          <w:szCs w:val="24"/>
+          <w:lang w:val="en-US"/>
+          <w14:ligatures w14:val="none"/>
+        </w:rPr>
+        <w:t xml:space="preserve"> </w:t>
+      </w:r>
+      <w:r>
+        <w:rPr>
+          <w:color w:val="FF0000"/>
+          <w:spacing w:val="2"/>
+        </w:rPr>
+        <w:t>xuyên tạc.</w:t>
+      </w:r>
+    </w:p>
+    <w:p>
+      <w:pPr>
+        <w:spacing w:after="0"/>
+        <w:ind w:left="0" w:firstLine="709"/>
+        <w:rPr>
+          <w:color w:val="FF0000"/>
+          <w:spacing w:val="2"/>
+        </w:rPr>
+      </w:pPr>
+      <w:r>
+        <w:rPr>
+          <w:color w:val="FF0000"/>
+          <w:spacing w:val="2"/>
+        </w:rPr>
+        <w:t>Đặc biệt, cần quán triệt tinh thần của Chủ tịch Hồ Chí Minh: “Nói đi đôi với làm”, lấy trách nhiệm với nhân dân và đất nước làm cơ sở hành động.</w:t>
+      </w:r>
+    </w:p>
+    <w:p>
+      <w:pPr>
+        <w:spacing w:after="0"/>
+        <w:ind w:left="0" w:firstLine="709"/>
+        <w:rPr>
+          <w:color w:val="FF0000"/>
+          <w:spacing w:val="2"/>
+        </w:rPr>
+      </w:pPr>
+      <w:r>
+        <w:rPr>
+          <w:color w:val="FF0000"/>
+          <w:spacing w:val="2"/>
+        </w:rPr>
+        <w:t>Vì vậy, trước những vấn đề phức tạp trên không gian mạng, mỗi quân nhân cần giữ vững bản lĩnh, không dao động, không a dua, không im lặng trước cái sai, đồng thời phải đấu tranh có lý, có tình, có căn cứ và đúng pháp luật.</w:t>
+      </w:r>
+    </w:p>
+    <w:p>
+      <w:pPr>
+        <w:spacing w:after="0"/>
+        <w:ind w:left="0" w:firstLine="709"/>
+        <w:rPr>
+          <w:color w:val="FF0000"/>
+          <w:spacing w:val="2"/>
+        </w:rPr>
+      </w:pPr>
+      <w:r>
+        <w:rPr>
+          <w:color w:val="FF0000"/>
+          <w:spacing w:val="2"/>
+        </w:rPr>
+        <w:t>Đấu tranh bảo vệ sự thật không phải bằng cảm xúc cực đoan; đấu tranh hiệu quả là dùng sự thật để bác bỏ thông tin sai trái.</w:t>
+      </w:r>
+    </w:p>
+    <w:p>
+      <w:pPr>
+        <w:spacing w:after="0"/>
+        <w:ind w:left="0" w:firstLine="709"/>
+        <w:rPr>
+          <w:bCs/>
+          <w:lang w:val="en-US"/>
+        </w:rPr>
+      </w:pPr>
+      <w:r>
+        <w:rPr>
+          <w:color w:val="FF0000"/>
+          <w:spacing w:val="2"/>
+        </w:rPr>
+        <w:t>Đó cũng là trách nhiệm của mỗi quân nhân trong việc giữ vững trận địa tư tưởng, góp phần bảo vệ hình ảnh Quân đội nhân dân Việt Nam và củng cố niềm tin của nhân dân.</w:t>
+      </w:r>
+      <w:r>
+        <w:rPr>
+          <w:bCs/>
+          <w:lang w:val="en-US"/>
+        </w:rPr>
+        <w:t xml:space="preserve"> </w:t>
+      </w:r>
+    </w:p>
+    <w:p>
+      <w:pPr>
+        <w:spacing w:after="0"/>
+        <w:ind w:left="0" w:firstLine="0"/>
+        <w:rPr>
+          <w:spacing w:val="2"/>
+        </w:rPr>
+      </w:pPr>
+    </w:p>
     <w:sectPr>
-      <w:pgSz w:w="11906" w:h="16838"/>
-      <w:pgMar w:top="1418" w:right="851" w:bottom="1134" w:left="1701" w:header="720" w:footer="720" w:gutter="0"/>
+      <w:headerReference w:type="default" r:id="rId7"/>
+      <w:pgSz w:w="11907" w:h="16840" w:code="9"/>
+      <w:pgMar w:top="1134" w:right="851" w:bottom="1134" w:left="1701" w:header="720" w:footer="720" w:gutter="0"/>
       <w:cols w:space="720"/>
-      <w:docGrid w:linePitch="360"/>
+      <w:titlePg/>
+      <w:docGrid w:linePitch="381"/>
     </w:sectPr>
   </w:body>
 </w:document>
+</file>
+
+<file path=word/endnotes.xml><?xml version="1.0" encoding="utf-8"?>
+<w:endnotes xmlns:wpc="http://schemas.microsoft.com/office/word/2010/wordprocessingCanvas" xmlns:cx="http://schemas.microsoft.com/office/drawing/2014/chartex" xmlns:cx1="http://schemas.microsoft.com/office/drawing/2015/9/8/chartex" xmlns:cx2="http://schemas.microsoft.com/office/drawing/2015/10/21/chartex" xmlns:cx3="http://schemas.microsoft.com/office/drawing/2016/5/9/chartex" xmlns:cx4="http://schemas.microsoft.com/office/drawing/2016/5/10/chartex" xmlns:cx5="http://schemas.microsoft.com/office/drawing/2016/5/11/chartex" xmlns:cx6="http://schemas.microsoft.com/office/drawing/2016/5/12/chartex" xmlns:cx7="http://schemas.microsoft.com/office/drawing/2016/5/13/chartex" xmlns:cx8="http://schemas.microsoft.com/office/drawing/2016/5/14/chartex" xmlns:mc="http://schemas.openxmlformats.org/markup-compatibility/2006" xmlns:aink="http://schemas.microsoft.com/office/drawing/2016/ink" xmlns:am3d="http://schemas.microsoft.com/office/drawing/2017/model3d" xmlns:o="urn:schemas-microsoft-com:office:office" xmlns:oel="http://schemas.microsoft.com/office/2019/extlst" xmlns:r="http://schemas.openxmlformats.org/officeDocument/2006/relationships" xmlns:m="http://schemas.openxmlformats.org/officeDocument/2006/math" xmlns:v="urn:schemas-microsoft-com:vml" xmlns:wp14="http://schemas.microsoft.com/office/word/2010/wordprocessingDrawing" xmlns:wp="http://schemas.openxmlformats.org/drawingml/2006/wordprocessingDrawing" xmlns:w10="urn:schemas-microsoft-com:office:word" xmlns:w="http://schemas.openxmlformats.org/wordprocessingml/2006/main" xmlns:w14="http://schemas.microsoft.com/office/word/2010/wordml" xmlns:w15="http://schemas.microsoft.com/office/word/2012/wordml" xmlns:w16cex="http://schemas.microsoft.com/office/word/2018/wordml/cex" xmlns:w16cid="http://schemas.microsoft.com/office/word/2016/wordml/cid" xmlns:w16="http://schemas.microsoft.com/office/word/2018/wordml" xmlns:w16du="http://schemas.microsoft.com/office/word/2023/wordml/word16du" xmlns:w16sdtdh="http://schemas.microsoft.com/office/word/2020/wordml/sdtdatahash" xmlns:w16sdtfl="http://schemas.microsoft.com/office/word/2024/wordml/sdtformatlock" xmlns:w16se="http://schemas.microsoft.com/office/word/2015/wordml/symex" xmlns:wpg="http://schemas.microsoft.com/office/word/2010/wordprocessingGroup" xmlns:wpi="http://schemas.microsoft.com/office/word/2010/wordprocessingInk" xmlns:wne="http://schemas.microsoft.com/office/word/2006/wordml" xmlns:wps="http://schemas.microsoft.com/office/word/2010/wordprocessingShape" mc:Ignorable="w14 w15 w16se w16cid w16 w16cex w16sdtdh w16sdtfl w16du wp14">
+  <w:endnote w:type="separator" w:id="-1">
+    <w:p>
+      <w:pPr>
+        <w:spacing w:after="0"/>
+      </w:pPr>
+      <w:r>
+        <w:separator/>
+      </w:r>
+    </w:p>
+  </w:endnote>
+  <w:endnote w:type="continuationSeparator" w:id="0">
+    <w:p>
+      <w:pPr>
+        <w:spacing w:after="0"/>
+      </w:pPr>
+      <w:r>
+        <w:continuationSeparator/>
+      </w:r>
+    </w:p>
+  </w:endnote>
+</w:endnotes>
+</file>
+
+<file path=word/footnotes.xml><?xml version="1.0" encoding="utf-8"?>
+<w:footnotes xmlns:wpc="http://schemas.microsoft.com/office/word/2010/wordprocessingCanvas" xmlns:cx="http://schemas.microsoft.com/office/drawing/2014/chartex" xmlns:cx1="http://schemas.microsoft.com/office/drawing/2015/9/8/chartex" xmlns:cx2="http://schemas.microsoft.com/office/drawing/2015/10/21/chartex" xmlns:cx3="http://schemas.microsoft.com/office/drawing/2016/5/9/chartex" xmlns:cx4="http://schemas.microsoft.com/office/drawing/2016/5/10/chartex" xmlns:cx5="http://schemas.microsoft.com/office/drawing/2016/5/11/chartex" xmlns:cx6="http://schemas.microsoft.com/office/drawing/2016/5/12/chartex" xmlns:cx7="http://schemas.microsoft.com/office/drawing/2016/5/13/chartex" xmlns:cx8="http://schemas.microsoft.com/office/drawing/2016/5/14/chartex" xmlns:mc="http://schemas.openxmlformats.org/markup-compatibility/2006" xmlns:aink="http://schemas.microsoft.com/office/drawing/2016/ink" xmlns:am3d="http://schemas.microsoft.com/office/drawing/2017/model3d" xmlns:o="urn:schemas-microsoft-com:office:office" xmlns:oel="http://schemas.microsoft.com/office/2019/extlst" xmlns:r="http://schemas.openxmlformats.org/officeDocument/2006/relationships" xmlns:m="http://schemas.openxmlformats.org/officeDocument/2006/math" xmlns:v="urn:schemas-microsoft-com:vml" xmlns:wp14="http://schemas.microsoft.com/office/word/2010/wordprocessingDrawing" xmlns:wp="http://schemas.openxmlformats.org/drawingml/2006/wordprocessingDrawing" xmlns:w10="urn:schemas-microsoft-com:office:word" xmlns:w="http://schemas.openxmlformats.org/wordprocessingml/2006/main" xmlns:w14="http://schemas.microsoft.com/office/word/2010/wordml" xmlns:w15="http://schemas.microsoft.com/office/word/2012/wordml" xmlns:w16cex="http://schemas.microsoft.com/office/word/2018/wordml/cex" xmlns:w16cid="http://schemas.microsoft.com/office/word/2016/wordml/cid" xmlns:w16="http://schemas.microsoft.com/office/word/2018/wordml" xmlns:w16du="http://schemas.microsoft.com/office/word/2023/wordml/word16du" xmlns:w16sdtdh="http://schemas.microsoft.com/office/word/2020/wordml/sdtdatahash" xmlns:w16sdtfl="http://schemas.microsoft.com/office/word/2024/wordml/sdtformatlock" xmlns:w16se="http://schemas.microsoft.com/office/word/2015/wordml/symex" xmlns:wpg="http://schemas.microsoft.com/office/word/2010/wordprocessingGroup" xmlns:wpi="http://schemas.microsoft.com/office/word/2010/wordprocessingInk" xmlns:wne="http://schemas.microsoft.com/office/word/2006/wordml" xmlns:wps="http://schemas.microsoft.com/office/word/2010/wordprocessingShape" mc:Ignorable="w14 w15 w16se w16cid w16 w16cex w16sdtdh w16sdtfl w16du wp14">
+  <w:footnote w:type="separator" w:id="-1">
+    <w:p>
+      <w:pPr>
+        <w:spacing w:after="0"/>
+      </w:pPr>
+      <w:r>
+        <w:separator/>
+      </w:r>
+    </w:p>
+  </w:footnote>
+  <w:footnote w:type="continuationSeparator" w:id="0">
+    <w:p>
+      <w:pPr>
+        <w:spacing w:after="0"/>
+      </w:pPr>
+      <w:r>
+        <w:continuationSeparator/>
+      </w:r>
+    </w:p>
+  </w:footnote>
+</w:footnotes>
+</file>
+
+<file path=word/header1.xml><?xml version="1.0" encoding="utf-8"?>
+<w:hdr xmlns:wpc="http://schemas.microsoft.com/office/word/2010/wordprocessingCanvas" xmlns:cx="http://schemas.microsoft.com/office/drawing/2014/chartex" xmlns:cx1="http://schemas.microsoft.com/office/drawing/2015/9/8/chartex" xmlns:cx2="http://schemas.microsoft.com/office/drawing/2015/10/21/chartex" xmlns:cx3="http://schemas.microsoft.com/office/drawing/2016/5/9/chartex" xmlns:cx4="http://schemas.microsoft.com/office/drawing/2016/5/10/chartex" xmlns:cx5="http://schemas.microsoft.com/office/drawing/2016/5/11/chartex" xmlns:cx6="http://schemas.microsoft.com/office/drawing/2016/5/12/chartex" xmlns:cx7="http://schemas.microsoft.com/office/drawing/2016/5/13/chartex" xmlns:cx8="http://schemas.microsoft.com/office/drawing/2016/5/14/chartex" xmlns:mc="http://schemas.openxmlformats.org/markup-compatibility/2006" xmlns:aink="http://schemas.microsoft.com/office/drawing/2016/ink" xmlns:am3d="http://schemas.microsoft.com/office/drawing/2017/model3d" xmlns:o="urn:schemas-microsoft-com:office:office" xmlns:oel="http://schemas.microsoft.com/office/2019/extlst" xmlns:r="http://schemas.openxmlformats.org/officeDocument/2006/relationships" xmlns:m="http://schemas.openxmlformats.org/officeDocument/2006/math" xmlns:v="urn:schemas-microsoft-com:vml" xmlns:wp14="http://schemas.microsoft.com/office/word/2010/wordprocessingDrawing" xmlns:wp="http://schemas.openxmlformats.org/drawingml/2006/wordprocessingDrawing" xmlns:w10="urn:schemas-microsoft-com:office:word" xmlns:w="http://schemas.openxmlformats.org/wordprocessingml/2006/main" xmlns:w14="http://schemas.microsoft.com/office/word/2010/wordml" xmlns:w15="http://schemas.microsoft.com/office/word/2012/wordml" xmlns:w16cex="http://schemas.microsoft.com/office/word/2018/wordml/cex" xmlns:w16cid="http://schemas.microsoft.com/office/word/2016/wordml/cid" xmlns:w16="http://schemas.microsoft.com/office/word/2018/wordml" xmlns:w16du="http://schemas.microsoft.com/office/word/2023/wordml/word16du" xmlns:w16sdtdh="http://schemas.microsoft.com/office/word/2020/wordml/sdtdatahash" xmlns:w16sdtfl="http://schemas.microsoft.com/office/word/2024/wordml/sdtformatlock" xmlns:w16se="http://schemas.microsoft.com/office/word/2015/wordml/symex" xmlns:wpg="http://schemas.microsoft.com/office/word/2010/wordprocessingGroup" xmlns:wpi="http://schemas.microsoft.com/office/word/2010/wordprocessingInk" xmlns:wne="http://schemas.microsoft.com/office/word/2006/wordml" xmlns:wps="http://schemas.microsoft.com/office/word/2010/wordprocessingShape" mc:Ignorable="w14 w15 w16se w16cid w16 w16cex w16sdtdh w16sdtfl w16du wp14">
+  <w:sdt>
+    <w:sdtPr>
+      <w:id w:val="-1325506763"/>
+      <w:docPartObj>
+        <w:docPartGallery w:val="Page Numbers (Top of Page)"/>
+        <w:docPartUnique/>
+      </w:docPartObj>
+    </w:sdtPr>
+    <w:sdtEndPr>
+      <w:rPr>
+        <w:noProof/>
+        <w:sz w:val="20"/>
+        <w:szCs w:val="16"/>
+      </w:rPr>
+    </w:sdtEndPr>
+    <w:sdtContent>
+      <w:p>
+        <w:pPr>
+          <w:pStyle w:val="Header"/>
+          <w:jc w:val="center"/>
+          <w:rPr>
+            <w:sz w:val="20"/>
+            <w:szCs w:val="16"/>
+          </w:rPr>
+        </w:pPr>
+        <w:r>
+          <w:rPr>
+            <w:sz w:val="20"/>
+            <w:szCs w:val="16"/>
+          </w:rPr>
+          <w:fldChar w:fldCharType="begin"/>
+        </w:r>
+        <w:r>
+          <w:rPr>
+            <w:sz w:val="20"/>
+            <w:szCs w:val="16"/>
+          </w:rPr>
+          <w:instrText xml:space="preserve"> PAGE   \* MERGEFORMAT </w:instrText>
+        </w:r>
+        <w:r>
+          <w:rPr>
+            <w:sz w:val="20"/>
+            <w:szCs w:val="16"/>
+          </w:rPr>
+          <w:fldChar w:fldCharType="separate"/>
+        </w:r>
+        <w:r>
+          <w:rPr>
+            <w:noProof/>
+            <w:sz w:val="20"/>
+            <w:szCs w:val="16"/>
+          </w:rPr>
+          <w:t>2</w:t>
+        </w:r>
+        <w:r>
+          <w:rPr>
+            <w:noProof/>
+            <w:sz w:val="20"/>
+            <w:szCs w:val="16"/>
+          </w:rPr>
+          <w:fldChar w:fldCharType="end"/>
+        </w:r>
+      </w:p>
+    </w:sdtContent>
+  </w:sdt>
+  <w:p>
+    <w:pPr>
+      <w:pStyle w:val="Header"/>
+    </w:pPr>
+  </w:p>
+</w:hdr>
 </file>
 
 <file path=word/styles.xml><?xml version="1.0" encoding="utf-8"?>
@@ -1715,17 +1979,19 @@
   <w:docDefaults>
     <w:rPrDefault>
       <w:rPr>
-        <w:rFonts w:asciiTheme="minorHAnsi" w:eastAsiaTheme="minorHAnsi" w:hAnsiTheme="minorHAnsi" w:cstheme="minorBidi"/>
+        <w:rFonts w:ascii="Times New Roman" w:eastAsiaTheme="minorHAnsi" w:hAnsi="Times New Roman" w:cstheme="minorBidi"/>
         <w:kern w:val="2"/>
-        <w:sz w:val="24"/>
-        <w:szCs w:val="24"/>
-        <w:lang w:val="en-US" w:eastAsia="en-US" w:bidi="ar-SA"/>
+        <w:sz w:val="28"/>
+        <w:szCs w:val="22"/>
+        <w:lang w:val="en-HK" w:eastAsia="en-US" w:bidi="ar-SA"/>
         <w14:ligatures w14:val="standardContextual"/>
       </w:rPr>
     </w:rPrDefault>
     <w:pPrDefault>
       <w:pPr>
-        <w:spacing w:after="160" w:line="278" w:lineRule="auto"/>
+        <w:spacing w:after="60"/>
+        <w:ind w:left="1134" w:firstLine="499"/>
+        <w:jc w:val="both"/>
       </w:pPr>
     </w:pPrDefault>
   </w:docDefaults>
@@ -2110,18 +2376,7 @@
   <w:style w:type="paragraph" w:default="1" w:styleId="Normal">
     <w:name w:val="Normal"/>
     <w:qFormat/>
-    <w:rsid w:val="00EE1B8E"/>
-    <w:pPr>
-      <w:spacing w:after="60" w:line="240" w:lineRule="auto"/>
-      <w:ind w:left="1134" w:firstLine="499"/>
-      <w:jc w:val="both"/>
-    </w:pPr>
-    <w:rPr>
-      <w:rFonts w:ascii="Times New Roman" w:hAnsi="Times New Roman"/>
-      <w:sz w:val="28"/>
-      <w:szCs w:val="22"/>
-      <w:lang w:val="en-HK"/>
-    </w:rPr>
+    <w:rsid w:val="00F623D9"/>
   </w:style>
   <w:style w:type="paragraph" w:styleId="Heading1">
     <w:name w:val="heading 1"/>
@@ -2130,13 +2385,11 @@
     <w:link w:val="Heading1Char"/>
     <w:uiPriority w:val="9"/>
     <w:qFormat/>
-    <w:rsid w:val="00EE1B8E"/>
+    <w:rsid w:val="00F959E2"/>
     <w:pPr>
       <w:keepNext/>
       <w:keepLines/>
       <w:spacing w:before="360" w:after="80"/>
-      <w:ind w:left="0" w:firstLine="0"/>
-      <w:jc w:val="left"/>
       <w:outlineLvl w:val="0"/>
     </w:pPr>
     <w:rPr>
@@ -2144,7 +2397,6 @@
       <w:color w:val="2F5496" w:themeColor="accent1" w:themeShade="BF"/>
       <w:sz w:val="40"/>
       <w:szCs w:val="40"/>
-      <w:lang w:val="en-US"/>
     </w:rPr>
   </w:style>
   <w:style w:type="paragraph" w:styleId="Heading2">
@@ -2156,13 +2408,11 @@
     <w:semiHidden/>
     <w:unhideWhenUsed/>
     <w:qFormat/>
-    <w:rsid w:val="00EE1B8E"/>
+    <w:rsid w:val="00F959E2"/>
     <w:pPr>
       <w:keepNext/>
       <w:keepLines/>
       <w:spacing w:before="160" w:after="80"/>
-      <w:ind w:left="0" w:firstLine="0"/>
-      <w:jc w:val="left"/>
       <w:outlineLvl w:val="1"/>
     </w:pPr>
     <w:rPr>
@@ -2170,7 +2420,6 @@
       <w:color w:val="2F5496" w:themeColor="accent1" w:themeShade="BF"/>
       <w:sz w:val="32"/>
       <w:szCs w:val="32"/>
-      <w:lang w:val="en-US"/>
     </w:rPr>
   </w:style>
   <w:style w:type="paragraph" w:styleId="Heading3">
@@ -2182,20 +2431,17 @@
     <w:semiHidden/>
     <w:unhideWhenUsed/>
     <w:qFormat/>
-    <w:rsid w:val="00EE1B8E"/>
+    <w:rsid w:val="00F959E2"/>
     <w:pPr>
       <w:keepNext/>
       <w:keepLines/>
       <w:spacing w:before="160" w:after="80"/>
-      <w:ind w:left="0" w:firstLine="0"/>
-      <w:jc w:val="left"/>
       <w:outlineLvl w:val="2"/>
     </w:pPr>
     <w:rPr>
       <w:rFonts w:asciiTheme="minorHAnsi" w:eastAsiaTheme="majorEastAsia" w:hAnsiTheme="minorHAnsi" w:cstheme="majorBidi"/>
       <w:color w:val="2F5496" w:themeColor="accent1" w:themeShade="BF"/>
       <w:szCs w:val="28"/>
-      <w:lang w:val="en-US"/>
     </w:rPr>
   </w:style>
   <w:style w:type="paragraph" w:styleId="Heading4">
@@ -2207,13 +2453,11 @@
     <w:semiHidden/>
     <w:unhideWhenUsed/>
     <w:qFormat/>
-    <w:rsid w:val="00EE1B8E"/>
+    <w:rsid w:val="00F959E2"/>
     <w:pPr>
       <w:keepNext/>
       <w:keepLines/>
       <w:spacing w:before="80" w:after="40"/>
-      <w:ind w:left="0" w:firstLine="0"/>
-      <w:jc w:val="left"/>
       <w:outlineLvl w:val="3"/>
     </w:pPr>
     <w:rPr>
@@ -2221,9 +2465,6 @@
       <w:i/>
       <w:iCs/>
       <w:color w:val="2F5496" w:themeColor="accent1" w:themeShade="BF"/>
-      <w:sz w:val="24"/>
-      <w:szCs w:val="24"/>
-      <w:lang w:val="en-US"/>
     </w:rPr>
   </w:style>
   <w:style w:type="paragraph" w:styleId="Heading5">
@@ -2235,21 +2476,16 @@
     <w:semiHidden/>
     <w:unhideWhenUsed/>
     <w:qFormat/>
-    <w:rsid w:val="00EE1B8E"/>
+    <w:rsid w:val="00F959E2"/>
     <w:pPr>
       <w:keepNext/>
       <w:keepLines/>
       <w:spacing w:before="80" w:after="40"/>
-      <w:ind w:left="0" w:firstLine="0"/>
-      <w:jc w:val="left"/>
       <w:outlineLvl w:val="4"/>
     </w:pPr>
     <w:rPr>
       <w:rFonts w:asciiTheme="minorHAnsi" w:eastAsiaTheme="majorEastAsia" w:hAnsiTheme="minorHAnsi" w:cstheme="majorBidi"/>
       <w:color w:val="2F5496" w:themeColor="accent1" w:themeShade="BF"/>
-      <w:sz w:val="24"/>
-      <w:szCs w:val="24"/>
-      <w:lang w:val="en-US"/>
     </w:rPr>
   </w:style>
   <w:style w:type="paragraph" w:styleId="Heading6">
@@ -2261,13 +2497,11 @@
     <w:semiHidden/>
     <w:unhideWhenUsed/>
     <w:qFormat/>
-    <w:rsid w:val="00EE1B8E"/>
+    <w:rsid w:val="00F959E2"/>
     <w:pPr>
       <w:keepNext/>
       <w:keepLines/>
       <w:spacing w:before="40" w:after="0"/>
-      <w:ind w:left="0" w:firstLine="0"/>
-      <w:jc w:val="left"/>
       <w:outlineLvl w:val="5"/>
     </w:pPr>
     <w:rPr>
@@ -2275,9 +2509,6 @@
       <w:i/>
       <w:iCs/>
       <w:color w:val="595959" w:themeColor="text1" w:themeTint="A6"/>
-      <w:sz w:val="24"/>
-      <w:szCs w:val="24"/>
-      <w:lang w:val="en-US"/>
     </w:rPr>
   </w:style>
   <w:style w:type="paragraph" w:styleId="Heading7">
@@ -2289,21 +2520,16 @@
     <w:semiHidden/>
     <w:unhideWhenUsed/>
     <w:qFormat/>
-    <w:rsid w:val="00EE1B8E"/>
+    <w:rsid w:val="00F959E2"/>
     <w:pPr>
       <w:keepNext/>
       <w:keepLines/>
       <w:spacing w:before="40" w:after="0"/>
-      <w:ind w:left="0" w:firstLine="0"/>
-      <w:jc w:val="left"/>
       <w:outlineLvl w:val="6"/>
     </w:pPr>
     <w:rPr>
       <w:rFonts w:asciiTheme="minorHAnsi" w:eastAsiaTheme="majorEastAsia" w:hAnsiTheme="minorHAnsi" w:cstheme="majorBidi"/>
       <w:color w:val="595959" w:themeColor="text1" w:themeTint="A6"/>
-      <w:sz w:val="24"/>
-      <w:szCs w:val="24"/>
-      <w:lang w:val="en-US"/>
     </w:rPr>
   </w:style>
   <w:style w:type="paragraph" w:styleId="Heading8">
@@ -2315,13 +2541,11 @@
     <w:semiHidden/>
     <w:unhideWhenUsed/>
     <w:qFormat/>
-    <w:rsid w:val="00EE1B8E"/>
+    <w:rsid w:val="00F959E2"/>
     <w:pPr>
       <w:keepNext/>
       <w:keepLines/>
       <w:spacing w:after="0"/>
-      <w:ind w:left="0" w:firstLine="0"/>
-      <w:jc w:val="left"/>
       <w:outlineLvl w:val="7"/>
     </w:pPr>
     <w:rPr>
@@ -2329,9 +2553,6 @@
       <w:i/>
       <w:iCs/>
       <w:color w:val="272727" w:themeColor="text1" w:themeTint="D8"/>
-      <w:sz w:val="24"/>
-      <w:szCs w:val="24"/>
-      <w:lang w:val="en-US"/>
     </w:rPr>
   </w:style>
   <w:style w:type="paragraph" w:styleId="Heading9">
@@ -2343,21 +2564,16 @@
     <w:semiHidden/>
     <w:unhideWhenUsed/>
     <w:qFormat/>
-    <w:rsid w:val="00EE1B8E"/>
+    <w:rsid w:val="00F959E2"/>
     <w:pPr>
       <w:keepNext/>
       <w:keepLines/>
       <w:spacing w:after="0"/>
-      <w:ind w:left="0" w:firstLine="0"/>
-      <w:jc w:val="left"/>
       <w:outlineLvl w:val="8"/>
     </w:pPr>
     <w:rPr>
       <w:rFonts w:asciiTheme="minorHAnsi" w:eastAsiaTheme="majorEastAsia" w:hAnsiTheme="minorHAnsi" w:cstheme="majorBidi"/>
       <w:color w:val="272727" w:themeColor="text1" w:themeTint="D8"/>
-      <w:sz w:val="24"/>
-      <w:szCs w:val="24"/>
-      <w:lang w:val="en-US"/>
     </w:rPr>
   </w:style>
   <w:style w:type="character" w:default="1" w:styleId="DefaultParagraphFont">
@@ -2392,7 +2608,7 @@
     <w:basedOn w:val="DefaultParagraphFont"/>
     <w:link w:val="Heading1"/>
     <w:uiPriority w:val="9"/>
-    <w:rsid w:val="00EE1B8E"/>
+    <w:rsid w:val="00F959E2"/>
     <w:rPr>
       <w:rFonts w:asciiTheme="majorHAnsi" w:eastAsiaTheme="majorEastAsia" w:hAnsiTheme="majorHAnsi" w:cstheme="majorBidi"/>
       <w:color w:val="2F5496" w:themeColor="accent1" w:themeShade="BF"/>
@@ -2406,7 +2622,7 @@
     <w:link w:val="Heading2"/>
     <w:uiPriority w:val="9"/>
     <w:semiHidden/>
-    <w:rsid w:val="00EE1B8E"/>
+    <w:rsid w:val="00F959E2"/>
     <w:rPr>
       <w:rFonts w:asciiTheme="majorHAnsi" w:eastAsiaTheme="majorEastAsia" w:hAnsiTheme="majorHAnsi" w:cstheme="majorBidi"/>
       <w:color w:val="2F5496" w:themeColor="accent1" w:themeShade="BF"/>
@@ -2420,11 +2636,10 @@
     <w:link w:val="Heading3"/>
     <w:uiPriority w:val="9"/>
     <w:semiHidden/>
-    <w:rsid w:val="00EE1B8E"/>
+    <w:rsid w:val="00F959E2"/>
     <w:rPr>
-      <w:rFonts w:eastAsiaTheme="majorEastAsia" w:cstheme="majorBidi"/>
+      <w:rFonts w:asciiTheme="minorHAnsi" w:eastAsiaTheme="majorEastAsia" w:hAnsiTheme="minorHAnsi" w:cstheme="majorBidi"/>
       <w:color w:val="2F5496" w:themeColor="accent1" w:themeShade="BF"/>
-      <w:sz w:val="28"/>
       <w:szCs w:val="28"/>
     </w:rPr>
   </w:style>
@@ -2434,9 +2649,9 @@
     <w:link w:val="Heading4"/>
     <w:uiPriority w:val="9"/>
     <w:semiHidden/>
-    <w:rsid w:val="00EE1B8E"/>
+    <w:rsid w:val="00F959E2"/>
     <w:rPr>
-      <w:rFonts w:eastAsiaTheme="majorEastAsia" w:cstheme="majorBidi"/>
+      <w:rFonts w:asciiTheme="minorHAnsi" w:eastAsiaTheme="majorEastAsia" w:hAnsiTheme="minorHAnsi" w:cstheme="majorBidi"/>
       <w:i/>
       <w:iCs/>
       <w:color w:val="2F5496" w:themeColor="accent1" w:themeShade="BF"/>
@@ -2448,9 +2663,9 @@
     <w:link w:val="Heading5"/>
     <w:uiPriority w:val="9"/>
     <w:semiHidden/>
-    <w:rsid w:val="00EE1B8E"/>
+    <w:rsid w:val="00F959E2"/>
     <w:rPr>
-      <w:rFonts w:eastAsiaTheme="majorEastAsia" w:cstheme="majorBidi"/>
+      <w:rFonts w:asciiTheme="minorHAnsi" w:eastAsiaTheme="majorEastAsia" w:hAnsiTheme="minorHAnsi" w:cstheme="majorBidi"/>
       <w:color w:val="2F5496" w:themeColor="accent1" w:themeShade="BF"/>
     </w:rPr>
   </w:style>
@@ -2460,9 +2675,9 @@
     <w:link w:val="Heading6"/>
     <w:uiPriority w:val="9"/>
     <w:semiHidden/>
-    <w:rsid w:val="00EE1B8E"/>
+    <w:rsid w:val="00F959E2"/>
     <w:rPr>
-      <w:rFonts w:eastAsiaTheme="majorEastAsia" w:cstheme="majorBidi"/>
+      <w:rFonts w:asciiTheme="minorHAnsi" w:eastAsiaTheme="majorEastAsia" w:hAnsiTheme="minorHAnsi" w:cstheme="majorBidi"/>
       <w:i/>
       <w:iCs/>
       <w:color w:val="595959" w:themeColor="text1" w:themeTint="A6"/>
@@ -2474,9 +2689,9 @@
     <w:link w:val="Heading7"/>
     <w:uiPriority w:val="9"/>
     <w:semiHidden/>
-    <w:rsid w:val="00EE1B8E"/>
+    <w:rsid w:val="00F959E2"/>
     <w:rPr>
-      <w:rFonts w:eastAsiaTheme="majorEastAsia" w:cstheme="majorBidi"/>
+      <w:rFonts w:asciiTheme="minorHAnsi" w:eastAsiaTheme="majorEastAsia" w:hAnsiTheme="minorHAnsi" w:cstheme="majorBidi"/>
       <w:color w:val="595959" w:themeColor="text1" w:themeTint="A6"/>
     </w:rPr>
   </w:style>
@@ -2486,9 +2701,9 @@
     <w:link w:val="Heading8"/>
     <w:uiPriority w:val="9"/>
     <w:semiHidden/>
-    <w:rsid w:val="00EE1B8E"/>
+    <w:rsid w:val="00F959E2"/>
     <w:rPr>
-      <w:rFonts w:eastAsiaTheme="majorEastAsia" w:cstheme="majorBidi"/>
+      <w:rFonts w:asciiTheme="minorHAnsi" w:eastAsiaTheme="majorEastAsia" w:hAnsiTheme="minorHAnsi" w:cstheme="majorBidi"/>
       <w:i/>
       <w:iCs/>
       <w:color w:val="272727" w:themeColor="text1" w:themeTint="D8"/>
@@ -2500,9 +2715,9 @@
     <w:link w:val="Heading9"/>
     <w:uiPriority w:val="9"/>
     <w:semiHidden/>
-    <w:rsid w:val="00EE1B8E"/>
+    <w:rsid w:val="00F959E2"/>
     <w:rPr>
-      <w:rFonts w:eastAsiaTheme="majorEastAsia" w:cstheme="majorBidi"/>
+      <w:rFonts w:asciiTheme="minorHAnsi" w:eastAsiaTheme="majorEastAsia" w:hAnsiTheme="minorHAnsi" w:cstheme="majorBidi"/>
       <w:color w:val="272727" w:themeColor="text1" w:themeTint="D8"/>
     </w:rPr>
   </w:style>
@@ -2513,12 +2728,10 @@
     <w:link w:val="TitleChar"/>
     <w:uiPriority w:val="10"/>
     <w:qFormat/>
-    <w:rsid w:val="00EE1B8E"/>
+    <w:rsid w:val="00F959E2"/>
     <w:pPr>
       <w:spacing w:after="80"/>
-      <w:ind w:left="0" w:firstLine="0"/>
       <w:contextualSpacing/>
-      <w:jc w:val="left"/>
     </w:pPr>
     <w:rPr>
       <w:rFonts w:asciiTheme="majorHAnsi" w:eastAsiaTheme="majorEastAsia" w:hAnsiTheme="majorHAnsi" w:cstheme="majorBidi"/>
@@ -2526,7 +2739,6 @@
       <w:kern w:val="28"/>
       <w:sz w:val="56"/>
       <w:szCs w:val="56"/>
-      <w:lang w:val="en-US"/>
     </w:rPr>
   </w:style>
   <w:style w:type="character" w:customStyle="1" w:styleId="TitleChar">
@@ -2534,7 +2746,7 @@
     <w:basedOn w:val="DefaultParagraphFont"/>
     <w:link w:val="Title"/>
     <w:uiPriority w:val="10"/>
-    <w:rsid w:val="00EE1B8E"/>
+    <w:rsid w:val="00F959E2"/>
     <w:rPr>
       <w:rFonts w:asciiTheme="majorHAnsi" w:eastAsiaTheme="majorEastAsia" w:hAnsiTheme="majorHAnsi" w:cstheme="majorBidi"/>
       <w:spacing w:val="-10"/>
@@ -2550,21 +2762,19 @@
     <w:link w:val="SubtitleChar"/>
     <w:uiPriority w:val="11"/>
     <w:qFormat/>
-    <w:rsid w:val="00EE1B8E"/>
+    <w:rsid w:val="00F959E2"/>
     <w:pPr>
       <w:numPr>
         <w:ilvl w:val="1"/>
       </w:numPr>
       <w:spacing w:after="160"/>
       <w:ind w:left="1134" w:firstLine="499"/>
-      <w:jc w:val="left"/>
     </w:pPr>
     <w:rPr>
       <w:rFonts w:asciiTheme="minorHAnsi" w:eastAsiaTheme="majorEastAsia" w:hAnsiTheme="minorHAnsi" w:cstheme="majorBidi"/>
       <w:color w:val="595959" w:themeColor="text1" w:themeTint="A6"/>
       <w:spacing w:val="15"/>
       <w:szCs w:val="28"/>
-      <w:lang w:val="en-US"/>
     </w:rPr>
   </w:style>
   <w:style w:type="character" w:customStyle="1" w:styleId="SubtitleChar">
@@ -2572,12 +2782,11 @@
     <w:basedOn w:val="DefaultParagraphFont"/>
     <w:link w:val="Subtitle"/>
     <w:uiPriority w:val="11"/>
-    <w:rsid w:val="00EE1B8E"/>
+    <w:rsid w:val="00F959E2"/>
     <w:rPr>
-      <w:rFonts w:eastAsiaTheme="majorEastAsia" w:cstheme="majorBidi"/>
+      <w:rFonts w:asciiTheme="minorHAnsi" w:eastAsiaTheme="majorEastAsia" w:hAnsiTheme="minorHAnsi" w:cstheme="majorBidi"/>
       <w:color w:val="595959" w:themeColor="text1" w:themeTint="A6"/>
       <w:spacing w:val="15"/>
-      <w:sz w:val="28"/>
       <w:szCs w:val="28"/>
     </w:rPr>
   </w:style>
@@ -2588,20 +2797,15 @@
     <w:link w:val="QuoteChar"/>
     <w:uiPriority w:val="29"/>
     <w:qFormat/>
-    <w:rsid w:val="00EE1B8E"/>
+    <w:rsid w:val="00F959E2"/>
     <w:pPr>
       <w:spacing w:before="160" w:after="160"/>
-      <w:ind w:left="0" w:firstLine="0"/>
       <w:jc w:val="center"/>
     </w:pPr>
     <w:rPr>
-      <w:rFonts w:asciiTheme="minorHAnsi" w:hAnsiTheme="minorHAnsi"/>
       <w:i/>
       <w:iCs/>
       <w:color w:val="404040" w:themeColor="text1" w:themeTint="BF"/>
-      <w:sz w:val="24"/>
-      <w:szCs w:val="24"/>
-      <w:lang w:val="en-US"/>
     </w:rPr>
   </w:style>
   <w:style w:type="character" w:customStyle="1" w:styleId="QuoteChar">
@@ -2609,7 +2813,8 @@
     <w:basedOn w:val="DefaultParagraphFont"/>
     <w:link w:val="Quote"/>
     <w:uiPriority w:val="29"/>
-    <w:rsid w:val="00EE1B8E"/>
+    <w:qFormat/>
+    <w:rsid w:val="00F959E2"/>
     <w:rPr>
       <w:i/>
       <w:iCs/>
@@ -2621,26 +2826,18 @@
     <w:basedOn w:val="Normal"/>
     <w:uiPriority w:val="34"/>
     <w:qFormat/>
-    <w:rsid w:val="00EE1B8E"/>
+    <w:rsid w:val="00F959E2"/>
     <w:pPr>
-      <w:spacing w:after="0"/>
-      <w:ind w:left="720" w:firstLine="0"/>
+      <w:ind w:left="720"/>
       <w:contextualSpacing/>
-      <w:jc w:val="left"/>
     </w:pPr>
-    <w:rPr>
-      <w:rFonts w:asciiTheme="minorHAnsi" w:hAnsiTheme="minorHAnsi"/>
-      <w:sz w:val="24"/>
-      <w:szCs w:val="24"/>
-      <w:lang w:val="en-US"/>
-    </w:rPr>
   </w:style>
   <w:style w:type="character" w:styleId="IntenseEmphasis">
     <w:name w:val="Intense Emphasis"/>
     <w:basedOn w:val="DefaultParagraphFont"/>
     <w:uiPriority w:val="21"/>
     <w:qFormat/>
-    <w:rsid w:val="00EE1B8E"/>
+    <w:rsid w:val="00F959E2"/>
     <w:rPr>
       <w:i/>
       <w:iCs/>
@@ -2654,24 +2851,20 @@
     <w:link w:val="IntenseQuoteChar"/>
     <w:uiPriority w:val="30"/>
     <w:qFormat/>
-    <w:rsid w:val="00EE1B8E"/>
+    <w:rsid w:val="00F959E2"/>
     <w:pPr>
       <w:pBdr>
         <w:top w:val="single" w:sz="4" w:space="10" w:color="2F5496" w:themeColor="accent1" w:themeShade="BF"/>
         <w:bottom w:val="single" w:sz="4" w:space="10" w:color="2F5496" w:themeColor="accent1" w:themeShade="BF"/>
       </w:pBdr>
       <w:spacing w:before="360" w:after="360"/>
-      <w:ind w:left="864" w:right="864" w:firstLine="0"/>
+      <w:ind w:left="864" w:right="864"/>
       <w:jc w:val="center"/>
     </w:pPr>
     <w:rPr>
-      <w:rFonts w:asciiTheme="minorHAnsi" w:hAnsiTheme="minorHAnsi"/>
       <w:i/>
       <w:iCs/>
       <w:color w:val="2F5496" w:themeColor="accent1" w:themeShade="BF"/>
-      <w:sz w:val="24"/>
-      <w:szCs w:val="24"/>
-      <w:lang w:val="en-US"/>
     </w:rPr>
   </w:style>
   <w:style w:type="character" w:customStyle="1" w:styleId="IntenseQuoteChar">
@@ -2679,7 +2872,7 @@
     <w:basedOn w:val="DefaultParagraphFont"/>
     <w:link w:val="IntenseQuote"/>
     <w:uiPriority w:val="30"/>
-    <w:rsid w:val="00EE1B8E"/>
+    <w:rsid w:val="00F959E2"/>
     <w:rPr>
       <w:i/>
       <w:iCs/>
@@ -2691,7 +2884,7 @@
     <w:basedOn w:val="DefaultParagraphFont"/>
     <w:uiPriority w:val="32"/>
     <w:qFormat/>
-    <w:rsid w:val="00EE1B8E"/>
+    <w:rsid w:val="00F959E2"/>
     <w:rPr>
       <w:b/>
       <w:bCs/>
@@ -2704,7 +2897,7 @@
     <w:name w:val="Body text (3)_"/>
     <w:link w:val="Bodytext31"/>
     <w:locked/>
-    <w:rsid w:val="00EE1B8E"/>
+    <w:rsid w:val="002A5310"/>
     <w:rPr>
       <w:shd w:val="clear" w:color="auto" w:fill="FFFFFF"/>
     </w:rPr>
@@ -2713,23 +2906,126 @@
     <w:name w:val="Body text (3)1"/>
     <w:basedOn w:val="Normal"/>
     <w:link w:val="Bodytext3"/>
-    <w:rsid w:val="00EE1B8E"/>
+    <w:rsid w:val="002A5310"/>
     <w:pPr>
       <w:widowControl w:val="0"/>
       <w:shd w:val="clear" w:color="auto" w:fill="FFFFFF"/>
       <w:spacing w:before="60" w:line="269" w:lineRule="exact"/>
       <w:ind w:left="0" w:firstLine="0"/>
     </w:pPr>
+  </w:style>
+  <w:style w:type="character" w:customStyle="1" w:styleId="5yl5">
+    <w:name w:val="_5yl5"/>
+    <w:rsid w:val="002A5310"/>
+  </w:style>
+  <w:style w:type="character" w:customStyle="1" w:styleId="SubtleReference1">
+    <w:name w:val="Subtle Reference1"/>
+    <w:basedOn w:val="DefaultParagraphFont"/>
+    <w:uiPriority w:val="31"/>
+    <w:qFormat/>
+    <w:rsid w:val="004C5191"/>
     <w:rPr>
-      <w:rFonts w:asciiTheme="minorHAnsi" w:hAnsiTheme="minorHAnsi"/>
+      <w:smallCaps/>
+      <w:color w:val="595959" w:themeColor="text1" w:themeTint="A6"/>
+    </w:rPr>
+  </w:style>
+  <w:style w:type="table" w:styleId="TableGrid">
+    <w:name w:val="Table Grid"/>
+    <w:basedOn w:val="TableNormal"/>
+    <w:uiPriority w:val="39"/>
+    <w:rsid w:val="00AF38ED"/>
+    <w:pPr>
+      <w:spacing w:after="0"/>
+    </w:pPr>
+    <w:tblPr>
+      <w:tblBorders>
+        <w:top w:val="single" w:sz="4" w:space="0" w:color="auto"/>
+        <w:left w:val="single" w:sz="4" w:space="0" w:color="auto"/>
+        <w:bottom w:val="single" w:sz="4" w:space="0" w:color="auto"/>
+        <w:right w:val="single" w:sz="4" w:space="0" w:color="auto"/>
+        <w:insideH w:val="single" w:sz="4" w:space="0" w:color="auto"/>
+        <w:insideV w:val="single" w:sz="4" w:space="0" w:color="auto"/>
+      </w:tblBorders>
+    </w:tblPr>
+  </w:style>
+  <w:style w:type="paragraph" w:styleId="Header">
+    <w:name w:val="header"/>
+    <w:basedOn w:val="Normal"/>
+    <w:link w:val="HeaderChar"/>
+    <w:uiPriority w:val="99"/>
+    <w:unhideWhenUsed/>
+    <w:rsid w:val="00AF38ED"/>
+    <w:pPr>
+      <w:tabs>
+        <w:tab w:val="center" w:pos="4680"/>
+        <w:tab w:val="right" w:pos="9360"/>
+      </w:tabs>
+      <w:spacing w:after="0"/>
+    </w:pPr>
+  </w:style>
+  <w:style w:type="character" w:customStyle="1" w:styleId="HeaderChar">
+    <w:name w:val="Header Char"/>
+    <w:basedOn w:val="DefaultParagraphFont"/>
+    <w:link w:val="Header"/>
+    <w:uiPriority w:val="99"/>
+    <w:rsid w:val="00AF38ED"/>
+  </w:style>
+  <w:style w:type="paragraph" w:styleId="Footer">
+    <w:name w:val="footer"/>
+    <w:basedOn w:val="Normal"/>
+    <w:link w:val="FooterChar"/>
+    <w:uiPriority w:val="99"/>
+    <w:unhideWhenUsed/>
+    <w:rsid w:val="00AF38ED"/>
+    <w:pPr>
+      <w:tabs>
+        <w:tab w:val="center" w:pos="4680"/>
+        <w:tab w:val="right" w:pos="9360"/>
+      </w:tabs>
+      <w:spacing w:after="0"/>
+    </w:pPr>
+  </w:style>
+  <w:style w:type="character" w:customStyle="1" w:styleId="FooterChar">
+    <w:name w:val="Footer Char"/>
+    <w:basedOn w:val="DefaultParagraphFont"/>
+    <w:link w:val="Footer"/>
+    <w:uiPriority w:val="99"/>
+    <w:rsid w:val="00AF38ED"/>
+  </w:style>
+  <w:style w:type="character" w:styleId="Hyperlink">
+    <w:name w:val="Hyperlink"/>
+    <w:basedOn w:val="DefaultParagraphFont"/>
+    <w:uiPriority w:val="99"/>
+    <w:unhideWhenUsed/>
+    <w:rsid w:val="00CA09E6"/>
+    <w:rPr>
+      <w:color w:val="0563C1" w:themeColor="hyperlink"/>
+      <w:u w:val="single"/>
+    </w:rPr>
+  </w:style>
+  <w:style w:type="paragraph" w:styleId="NormalWeb">
+    <w:name w:val="Normal (Web)"/>
+    <w:basedOn w:val="Normal"/>
+    <w:uiPriority w:val="99"/>
+    <w:semiHidden/>
+    <w:unhideWhenUsed/>
+    <w:rsid w:val="00F1501C"/>
+    <w:rPr>
+      <w:rFonts w:cs="Times New Roman"/>
       <w:sz w:val="24"/>
       <w:szCs w:val="24"/>
-      <w:lang w:val="en-US"/>
     </w:rPr>
   </w:style>
-  <w:style w:type="character" w:customStyle="1" w:styleId="5yl5">
-    <w:name w:val="_5yl5"/>
-    <w:rsid w:val="00EE1B8E"/>
+  <w:style w:type="character" w:styleId="Strong">
+    <w:name w:val="Strong"/>
+    <w:basedOn w:val="DefaultParagraphFont"/>
+    <w:uiPriority w:val="22"/>
+    <w:qFormat/>
+    <w:rsid w:val="00564710"/>
+    <w:rPr>
+      <w:b/>
+      <w:bCs/>
+    </w:rPr>
   </w:style>
 </w:styles>
 </file>
@@ -3027,4 +3323,16 @@
     </a:ext>
   </a:extLst>
 </a:theme>
+</file>
+
+<file path=customXml/item1.xml><?xml version="1.0" encoding="utf-8"?>
+<b:Sources xmlns:b="http://schemas.openxmlformats.org/officeDocument/2006/bibliography" xmlns="http://schemas.openxmlformats.org/officeDocument/2006/bibliography" SelectedStyle="\APASixthEditionOfficeOnline.xsl" StyleName="APA" Version="6"/>
+</file>
+
+<file path=customXml/itemProps1.xml><?xml version="1.0" encoding="utf-8"?>
+<ds:datastoreItem xmlns:ds="http://schemas.openxmlformats.org/officeDocument/2006/customXml" ds:itemID="{AA0594C6-66B0-4EB8-92BB-35F43F739F42}">
+  <ds:schemaRefs>
+    <ds:schemaRef ds:uri="http://schemas.openxmlformats.org/officeDocument/2006/bibliography"/>
+  </ds:schemaRefs>
+</ds:datastoreItem>
 </file>
</xml_diff>